<commit_message>
ABR Quote: customer-facing Explanation of Benefit letter
- New abr_explanation.py: builds the explanation as a formal claims letter
  (HTML for Resources panel + Word export), always as a full acceleration
  of the user-entered Eligible Death Benefit (Option B support), with
  state-specific admin fee, NAIC 620 6.D tax/Medicaid notices (IRC 101(g)),
  morbidity-vs-mortality explanation, and 'How the actuarial discount is
  calculated' section. No life-expectancy figures per business decision.
- Resources dialog: dynamic Explanation of Benefit topic with Word export;
  window passes level premium + eligible-DB override.
- suiteview/core/word_export.py: shared open-in-Word COM helper.
- tools/abrquote: verify_explanation smoke test + screenshot tool.
- docs/ABRQuote: disclosure framework + letter template (MD), placeholder
  Word template, ABR14 rider specimen PDFs and actuarial filing reference.
</commit_message>
<xml_diff>
--- a/docs/ABRQuote/Explaination of Change to Life Expectancy Calcuation.docx
+++ b/docs/ABRQuote/Explaination of Change to Life Expectancy Calcuation.docx
@@ -1,6 +1,6 @@
 
 <file path=word/document.xml><?xml version="1.0" encoding="utf-8"?>
-<w:document xmlns:wpc="http://schemas.microsoft.com/office/word/2010/wordprocessingCanvas" xmlns:cx="http://schemas.microsoft.com/office/drawing/2014/chartex" xmlns:cx1="http://schemas.microsoft.com/office/drawing/2015/9/8/chartex" xmlns:cx2="http://schemas.microsoft.com/office/drawing/2015/10/21/chartex" xmlns:cx3="http://schemas.microsoft.com/office/drawing/2016/5/9/chartex" xmlns:cx4="http://schemas.microsoft.com/office/drawing/2016/5/10/chartex" xmlns:cx5="http://schemas.microsoft.com/office/drawing/2016/5/11/chartex" xmlns:cx6="http://schemas.microsoft.com/office/drawing/2016/5/12/chartex" xmlns:cx7="http://schemas.microsoft.com/office/drawing/2016/5/13/chartex" xmlns:cx8="http://schemas.microsoft.com/office/drawing/2016/5/14/chartex" xmlns:mc="http://schemas.openxmlformats.org/markup-compatibility/2006" xmlns:aink="http://schemas.microsoft.com/office/drawing/2016/ink" xmlns:am3d="http://schemas.microsoft.com/office/drawing/2017/model3d" xmlns:o="urn:schemas-microsoft-com:office:office" xmlns:oel="http://schemas.microsoft.com/office/2019/extlst" xmlns:r="http://schemas.openxmlformats.org/officeDocument/2006/relationships" xmlns:m="http://schemas.openxmlformats.org/officeDocument/2006/math" xmlns:v="urn:schemas-microsoft-com:vml" xmlns:wp14="http://schemas.microsoft.com/office/word/2010/wordprocessingDrawing" xmlns:wp="http://schemas.openxmlformats.org/drawingml/2006/wordprocessingDrawing" xmlns:w10="urn:schemas-microsoft-com:office:word" xmlns:w="http://schemas.openxmlformats.org/wordprocessingml/2006/main" xmlns:w14="http://schemas.microsoft.com/office/word/2010/wordml" xmlns:w15="http://schemas.microsoft.com/office/word/2012/wordml" xmlns:w16cex="http://schemas.microsoft.com/office/word/2018/wordml/cex" xmlns:w16cid="http://schemas.microsoft.com/office/word/2016/wordml/cid" xmlns:w16="http://schemas.microsoft.com/office/word/2018/wordml" xmlns:w16du="http://schemas.microsoft.com/office/word/2023/wordml/word16du" xmlns:w16sdtdh="http://schemas.microsoft.com/office/word/2020/wordml/sdtdatahash" xmlns:w16sdtfl="http://schemas.microsoft.com/office/word/2024/wordml/sdtformatlock" xmlns:w16se="http://schemas.microsoft.com/office/word/2015/wordml/symex" xmlns:wpg="http://schemas.microsoft.com/office/word/2010/wordprocessingGroup" xmlns:wpi="http://schemas.microsoft.com/office/word/2010/wordprocessingInk" xmlns:wne="http://schemas.microsoft.com/office/word/2006/wordml" xmlns:wps="http://schemas.microsoft.com/office/word/2010/wordprocessingShape" mc:Ignorable="w14 w15 w16se w16cid w16 w16cex w16sdtdh w16sdtfl w16du wp14">
+<w:document xmlns:wpc="http://schemas.microsoft.com/office/word/2010/wordprocessingCanvas" xmlns:cx="http://schemas.microsoft.com/office/drawing/2014/chartex" xmlns:cx1="http://schemas.microsoft.com/office/drawing/2015/9/8/chartex" xmlns:cx2="http://schemas.microsoft.com/office/drawing/2015/10/21/chartex" xmlns:cx3="http://schemas.microsoft.com/office/drawing/2016/5/9/chartex" xmlns:cx4="http://schemas.microsoft.com/office/drawing/2016/5/10/chartex" xmlns:cx5="http://schemas.microsoft.com/office/drawing/2016/5/11/chartex" xmlns:cx6="http://schemas.microsoft.com/office/drawing/2016/5/12/chartex" xmlns:cx7="http://schemas.microsoft.com/office/drawing/2016/5/13/chartex" xmlns:cx8="http://schemas.microsoft.com/office/drawing/2016/5/14/chartex" xmlns:mc="http://schemas.openxmlformats.org/markup-compatibility/2006" xmlns:aink="http://schemas.microsoft.com/office/drawing/2016/ink" xmlns:am3d="http://schemas.microsoft.com/office/drawing/2017/model3d" xmlns:o="urn:schemas-microsoft-com:office:office" xmlns:oel="http://schemas.microsoft.com/office/2019/extlst" xmlns:r="http://schemas.openxmlformats.org/officeDocument/2006/relationships" xmlns:m="http://schemas.openxmlformats.org/officeDocument/2006/math" xmlns:v="urn:schemas-microsoft-com:vml" xmlns:wp14="http://schemas.microsoft.com/office/word/2010/wordprocessingDrawing" xmlns:wp="http://schemas.openxmlformats.org/drawingml/2006/wordprocessingDrawing" xmlns:w10="urn:schemas-microsoft-com:office:word" xmlns:w="http://schemas.openxmlformats.org/wordprocessingml/2006/main" xmlns:w14="http://schemas.microsoft.com/office/word/2010/wordml" xmlns:w15="http://schemas.microsoft.com/office/word/2012/wordml" xmlns:w16cei="http://schemas.microsoft.com/office/word/2026/wordml/cei" xmlns:w16cex="http://schemas.microsoft.com/office/word/2018/wordml/cex" xmlns:w16cid="http://schemas.microsoft.com/office/word/2016/wordml/cid" xmlns:w16="http://schemas.microsoft.com/office/word/2018/wordml" xmlns:w16du="http://schemas.microsoft.com/office/word/2023/wordml/word16du" xmlns:w16sdtdh="http://schemas.microsoft.com/office/word/2020/wordml/sdtdatahash" xmlns:w16sdtfl="http://schemas.microsoft.com/office/word/2024/wordml/sdtformatlock" xmlns:w16se="http://schemas.microsoft.com/office/word/2015/wordml/symex" xmlns:wpg="http://schemas.microsoft.com/office/word/2010/wordprocessingGroup" xmlns:wpi="http://schemas.microsoft.com/office/word/2010/wordprocessingInk" xmlns:wne="http://schemas.microsoft.com/office/word/2006/wordml" xmlns:wps="http://schemas.microsoft.com/office/word/2010/wordprocessingShape" mc:Ignorable="w14 w15 w16se w16cid w16 w16cex w16sdtdh w16sdtfl w16du wp14">
   <w:body>
     <w:p>
       <w:r>
@@ -331,6 +331,244 @@
           <w14:ligatures w14:val="none"/>
         </w:rPr>
         <w:t>Therefore, the 0.5-year adjustment has been removed because the revised monthly methodology already incorporates the timing of deaths within the year and provides a more accurate estimate of life expectancy than the prior annual approach.</w:t>
+      </w:r>
+    </w:p>
+    <w:p/>
+    <w:p/>
+    <w:p/>
+    <w:p/>
+    <w:p>
+      <w:pPr>
+        <w:pBdr>
+          <w:bottom w:val="double" w:sz="6" w:space="1" w:color="auto"/>
+        </w:pBdr>
+      </w:pPr>
+    </w:p>
+    <w:p>
+      <w:pPr>
+        <w:rPr>
+          <w:rFonts w:eastAsia="Times New Roman"/>
+          <w:color w:val="000000"/>
+        </w:rPr>
+      </w:pPr>
+      <w:r>
+        <w:rPr>
+          <w:rFonts w:eastAsia="Times New Roman"/>
+          <w:color w:val="000000"/>
+        </w:rPr>
+        <w:lastRenderedPageBreak/>
+        <w:t>The actuarial discount is determined by the following factors: the portion of the eligible death benefit accelerated, the cash surrender value of the base policy, any future premiums required to be paid to keep the eligible death benefit in force, any future anticipated dividends for the base policy, the accelerated benefit interest rate in effect, and our determination of the future expected mortality of the qualifying rider insured.</w:t>
+      </w:r>
+    </w:p>
+    <w:p>
+      <w:pPr>
+        <w:rPr>
+          <w:rFonts w:eastAsia="Times New Roman"/>
+          <w:color w:val="000000"/>
+        </w:rPr>
+      </w:pPr>
+      <w:r>
+        <w:rPr>
+          <w:rFonts w:eastAsia="Times New Roman"/>
+          <w:color w:val="000000"/>
+        </w:rPr>
+        <w:t> </w:t>
+      </w:r>
+    </w:p>
+    <w:p>
+      <w:pPr>
+        <w:rPr>
+          <w:rFonts w:eastAsia="Times New Roman"/>
+          <w:color w:val="000000"/>
+        </w:rPr>
+      </w:pPr>
+      <w:r>
+        <w:rPr>
+          <w:rFonts w:eastAsia="Times New Roman"/>
+          <w:color w:val="000000"/>
+        </w:rPr>
+        <w:t>In summary, Actuarial Discount = (Amount to Accelerate) – [(Present Value of the Future Death Benefit) – (Present Value of the Future Premiums)].</w:t>
+      </w:r>
+    </w:p>
+    <w:p>
+      <w:pPr>
+        <w:rPr>
+          <w:rFonts w:eastAsia="Times New Roman"/>
+          <w:color w:val="000000"/>
+        </w:rPr>
+      </w:pPr>
+      <w:r>
+        <w:rPr>
+          <w:rFonts w:eastAsia="Times New Roman"/>
+          <w:color w:val="000000"/>
+        </w:rPr>
+        <w:t> </w:t>
+      </w:r>
+    </w:p>
+    <w:p>
+      <w:pPr>
+        <w:rPr>
+          <w:rFonts w:eastAsia="Times New Roman"/>
+          <w:color w:val="000000"/>
+        </w:rPr>
+      </w:pPr>
+      <w:r>
+        <w:rPr>
+          <w:rFonts w:eastAsia="Times New Roman"/>
+          <w:color w:val="000000"/>
+        </w:rPr>
+        <w:t xml:space="preserve">The higher the Present Value of Future Premiums </w:t>
+      </w:r>
+      <w:proofErr w:type="gramStart"/>
+      <w:r>
+        <w:rPr>
+          <w:rFonts w:eastAsia="Times New Roman"/>
+          <w:color w:val="000000"/>
+        </w:rPr>
+        <w:t>are</w:t>
+      </w:r>
+      <w:proofErr w:type="gramEnd"/>
+      <w:r>
+        <w:rPr>
+          <w:rFonts w:eastAsia="Times New Roman"/>
+          <w:color w:val="000000"/>
+        </w:rPr>
+        <w:t>, the higher the Actuarial Discount will be. The Present Value of Future Premiums is determined based on the insured’s future expected mortality. Since the future life expectancy of the modified mortality table is 4.76 years, we expect to receive roughly 4.76 more years of premium on this policy. In addition, the insured has an Annual Renewable Term policy, so the annually increasing premiums would have been significantly higher had there been no modified mortality, further increasing the Actuarial Discount amount that accounts for the present value of the future death benefit.</w:t>
+      </w:r>
+    </w:p>
+    <w:p>
+      <w:pPr>
+        <w:rPr>
+          <w:rFonts w:eastAsia="Times New Roman"/>
+          <w:color w:val="000000"/>
+        </w:rPr>
+      </w:pPr>
+      <w:r>
+        <w:rPr>
+          <w:rFonts w:eastAsia="Times New Roman"/>
+          <w:color w:val="000000"/>
+        </w:rPr>
+        <w:t> </w:t>
+      </w:r>
+    </w:p>
+    <w:p>
+      <w:pPr>
+        <w:rPr>
+          <w:rFonts w:eastAsia="Times New Roman"/>
+          <w:color w:val="000000"/>
+        </w:rPr>
+      </w:pPr>
+      <w:r>
+        <w:rPr>
+          <w:rFonts w:eastAsia="Times New Roman"/>
+          <w:color w:val="000000"/>
+        </w:rPr>
+        <w:t>PVFB=Present Value of Future Benefits</w:t>
+      </w:r>
+    </w:p>
+    <w:p>
+      <w:pPr>
+        <w:rPr>
+          <w:rFonts w:eastAsia="Times New Roman"/>
+          <w:color w:val="000000"/>
+        </w:rPr>
+      </w:pPr>
+      <w:r>
+        <w:rPr>
+          <w:rFonts w:eastAsia="Times New Roman"/>
+          <w:color w:val="000000"/>
+        </w:rPr>
+        <w:t>PVFP=Present Value of Future Premiums</w:t>
+      </w:r>
+    </w:p>
+    <w:p>
+      <w:pPr>
+        <w:rPr>
+          <w:rFonts w:eastAsia="Times New Roman"/>
+          <w:color w:val="000000"/>
+        </w:rPr>
+      </w:pPr>
+      <w:r>
+        <w:rPr>
+          <w:rFonts w:eastAsia="Times New Roman"/>
+          <w:color w:val="000000"/>
+        </w:rPr>
+        <w:t>PVFD=Present Value of Future Dividends?</w:t>
+      </w:r>
+    </w:p>
+    <w:p>
+      <w:pPr>
+        <w:rPr>
+          <w:rFonts w:eastAsia="Times New Roman"/>
+          <w:color w:val="000000"/>
+        </w:rPr>
+      </w:pPr>
+      <w:r>
+        <w:rPr>
+          <w:rFonts w:eastAsia="Times New Roman"/>
+          <w:color w:val="000000"/>
+        </w:rPr>
+        <w:t> </w:t>
+      </w:r>
+    </w:p>
+    <w:p>
+      <w:pPr>
+        <w:rPr>
+          <w:rFonts w:eastAsia="Times New Roman"/>
+          <w:color w:val="000000"/>
+        </w:rPr>
+      </w:pPr>
+      <w:r>
+        <w:rPr>
+          <w:rFonts w:eastAsia="Times New Roman"/>
+          <w:color w:val="000000"/>
+        </w:rPr>
+        <w:t>The higher the rate class the lower the prem per unit therefore they will get a higher payout</w:t>
+      </w:r>
+    </w:p>
+    <w:p>
+      <w:pPr>
+        <w:rPr>
+          <w:rFonts w:eastAsia="Times New Roman"/>
+          <w:color w:val="000000"/>
+        </w:rPr>
+      </w:pPr>
+      <w:r>
+        <w:rPr>
+          <w:rFonts w:eastAsia="Times New Roman"/>
+          <w:color w:val="000000"/>
+        </w:rPr>
+        <w:t> </w:t>
+      </w:r>
+    </w:p>
+    <w:p>
+      <w:pPr>
+        <w:rPr>
+          <w:rFonts w:eastAsia="Times New Roman"/>
+          <w:color w:val="000000"/>
+        </w:rPr>
+      </w:pPr>
+      <w:r>
+        <w:rPr>
+          <w:rFonts w:eastAsia="Times New Roman"/>
+          <w:color w:val="000000"/>
+        </w:rPr>
+        <w:t> </w:t>
+      </w:r>
+    </w:p>
+    <w:p>
+      <w:pPr>
+        <w:rPr>
+          <w:rFonts w:eastAsia="Times New Roman"/>
+          <w:color w:val="000000"/>
+        </w:rPr>
+      </w:pPr>
+      <w:r>
+        <w:rPr>
+          <w:rFonts w:eastAsia="Times New Roman"/>
+          <w:color w:val="000000"/>
+        </w:rPr>
+        <w:t>Interest Rate - Lower rate will give higher payout, higher rate will give lower payout</w:t>
       </w:r>
     </w:p>
     <w:p/>

</xml_diff>